<commit_message>
feat(docx-template): add service_type, start_time, end_time placeholders
- scripts/create-installation-template.ts: add Row 5 to System Info table
  with label/value pairs for Service Type / Start Time / End Time
- lib/docx-builders/installation-template.ts: add service_type, start_time,
  end_time to doc.render() — values sourced from InstallationContent fields
  with empty-string fallback via nullGetter
- Regenerated references/templates/installation-report-template.docx

Co-Authored-By: Claude Sonnet 4.6 <noreply@anthropic.com>
</commit_message>
<xml_diff>
--- a/references/templates/installation-report-template.docx
+++ b/references/templates/installation-report-template.docx
@@ -998,6 +998,179 @@
                 <w:szCs w:val="18"/>
               </w:rPr>
               <w:t xml:space="preserve">{email}</w:t>
+            </w:r>
+          </w:p>
+        </w:tc>
+      </w:tr>
+      <w:tr>
+        <w:tc>
+          <w:tcPr>
+            <w:tcW w:type="pct" w:w="10%"/>
+            <w:gridSpan w:val="1"/>
+            <w:tcBorders>
+              <w:top w:val="single" w:color="AAAAAA" w:sz="4"/>
+              <w:left w:val="single" w:color="AAAAAA" w:sz="4"/>
+              <w:bottom w:val="single" w:color="AAAAAA" w:sz="4"/>
+              <w:right w:val="single" w:color="AAAAAA" w:sz="4"/>
+            </w:tcBorders>
+            <w:shd w:color="D9E2F3" w:val="solid"/>
+            <w:vAlign w:val="center"/>
+          </w:tcPr>
+          <w:p>
+            <w:pPr>
+              <w:spacing w:after="20" w:before="20"/>
+            </w:pPr>
+            <w:r>
+              <w:rPr>
+                <w:rFonts w:ascii="Calibri" w:cs="Calibri" w:eastAsia="Calibri" w:hAnsi="Calibri"/>
+                <w:b/>
+                <w:bCs/>
+                <w:color w:val="1B3769"/>
+                <w:sz w:val="17"/>
+                <w:szCs w:val="17"/>
+              </w:rPr>
+              <w:t xml:space="preserve">Service Type</w:t>
+            </w:r>
+          </w:p>
+        </w:tc>
+        <w:tc>
+          <w:tcPr>
+            <w:tcW w:type="pct" w:w="23%"/>
+            <w:gridSpan w:val="1"/>
+            <w:tcBorders>
+              <w:top w:val="single" w:color="AAAAAA" w:sz="4"/>
+              <w:left w:val="single" w:color="AAAAAA" w:sz="4"/>
+              <w:bottom w:val="single" w:color="AAAAAA" w:sz="4"/>
+              <w:right w:val="single" w:color="AAAAAA" w:sz="4"/>
+            </w:tcBorders>
+            <w:vAlign w:val="center"/>
+          </w:tcPr>
+          <w:p>
+            <w:pPr>
+              <w:spacing w:after="20" w:before="20"/>
+            </w:pPr>
+            <w:r>
+              <w:rPr>
+                <w:rFonts w:ascii="Calibri" w:cs="Calibri" w:eastAsia="Calibri" w:hAnsi="Calibri"/>
+                <w:color w:val="1A1A2E"/>
+                <w:sz w:val="18"/>
+                <w:szCs w:val="18"/>
+              </w:rPr>
+              <w:t xml:space="preserve">{service_type}</w:t>
+            </w:r>
+          </w:p>
+        </w:tc>
+        <w:tc>
+          <w:tcPr>
+            <w:tcW w:type="pct" w:w="10%"/>
+            <w:gridSpan w:val="1"/>
+            <w:tcBorders>
+              <w:top w:val="single" w:color="AAAAAA" w:sz="4"/>
+              <w:left w:val="single" w:color="AAAAAA" w:sz="4"/>
+              <w:bottom w:val="single" w:color="AAAAAA" w:sz="4"/>
+              <w:right w:val="single" w:color="AAAAAA" w:sz="4"/>
+            </w:tcBorders>
+            <w:shd w:color="D9E2F3" w:val="solid"/>
+            <w:vAlign w:val="center"/>
+          </w:tcPr>
+          <w:p>
+            <w:pPr>
+              <w:spacing w:after="20" w:before="20"/>
+            </w:pPr>
+            <w:r>
+              <w:rPr>
+                <w:rFonts w:ascii="Calibri" w:cs="Calibri" w:eastAsia="Calibri" w:hAnsi="Calibri"/>
+                <w:b/>
+                <w:bCs/>
+                <w:color w:val="1B3769"/>
+                <w:sz w:val="17"/>
+                <w:szCs w:val="17"/>
+              </w:rPr>
+              <w:t xml:space="preserve">Start Time</w:t>
+            </w:r>
+          </w:p>
+        </w:tc>
+        <w:tc>
+          <w:tcPr>
+            <w:tcW w:type="pct" w:w="24%"/>
+            <w:gridSpan w:val="1"/>
+            <w:tcBorders>
+              <w:top w:val="single" w:color="AAAAAA" w:sz="4"/>
+              <w:left w:val="single" w:color="AAAAAA" w:sz="4"/>
+              <w:bottom w:val="single" w:color="AAAAAA" w:sz="4"/>
+              <w:right w:val="single" w:color="AAAAAA" w:sz="4"/>
+            </w:tcBorders>
+            <w:vAlign w:val="center"/>
+          </w:tcPr>
+          <w:p>
+            <w:pPr>
+              <w:spacing w:after="20" w:before="20"/>
+            </w:pPr>
+            <w:r>
+              <w:rPr>
+                <w:rFonts w:ascii="Calibri" w:cs="Calibri" w:eastAsia="Calibri" w:hAnsi="Calibri"/>
+                <w:color w:val="1A1A2E"/>
+                <w:sz w:val="18"/>
+                <w:szCs w:val="18"/>
+              </w:rPr>
+              <w:t xml:space="preserve">{start_time}</w:t>
+            </w:r>
+          </w:p>
+        </w:tc>
+        <w:tc>
+          <w:tcPr>
+            <w:tcW w:type="pct" w:w="10%"/>
+            <w:gridSpan w:val="1"/>
+            <w:tcBorders>
+              <w:top w:val="single" w:color="AAAAAA" w:sz="4"/>
+              <w:left w:val="single" w:color="AAAAAA" w:sz="4"/>
+              <w:bottom w:val="single" w:color="AAAAAA" w:sz="4"/>
+              <w:right w:val="single" w:color="AAAAAA" w:sz="4"/>
+            </w:tcBorders>
+            <w:shd w:color="D9E2F3" w:val="solid"/>
+            <w:vAlign w:val="center"/>
+          </w:tcPr>
+          <w:p>
+            <w:pPr>
+              <w:spacing w:after="20" w:before="20"/>
+            </w:pPr>
+            <w:r>
+              <w:rPr>
+                <w:rFonts w:ascii="Calibri" w:cs="Calibri" w:eastAsia="Calibri" w:hAnsi="Calibri"/>
+                <w:b/>
+                <w:bCs/>
+                <w:color w:val="1B3769"/>
+                <w:sz w:val="17"/>
+                <w:szCs w:val="17"/>
+              </w:rPr>
+              <w:t xml:space="preserve">End Time</w:t>
+            </w:r>
+          </w:p>
+        </w:tc>
+        <w:tc>
+          <w:tcPr>
+            <w:tcW w:type="pct" w:w="23%"/>
+            <w:gridSpan w:val="1"/>
+            <w:tcBorders>
+              <w:top w:val="single" w:color="AAAAAA" w:sz="4"/>
+              <w:left w:val="single" w:color="AAAAAA" w:sz="4"/>
+              <w:bottom w:val="single" w:color="AAAAAA" w:sz="4"/>
+              <w:right w:val="single" w:color="AAAAAA" w:sz="4"/>
+            </w:tcBorders>
+            <w:vAlign w:val="center"/>
+          </w:tcPr>
+          <w:p>
+            <w:pPr>
+              <w:spacing w:after="20" w:before="20"/>
+            </w:pPr>
+            <w:r>
+              <w:rPr>
+                <w:rFonts w:ascii="Calibri" w:cs="Calibri" w:eastAsia="Calibri" w:hAnsi="Calibri"/>
+                <w:color w:val="1A1A2E"/>
+                <w:sz w:val="18"/>
+                <w:szCs w:val="18"/>
+              </w:rPr>
+              <w:t xml:space="preserve">{end_time}</w:t>
             </w:r>
           </w:p>
         </w:tc>

</xml_diff>

<commit_message>
feat: Installation Export xlsx + Work Completion section
- Add Export Reports (.xlsx) button to installation card page
  (filename: yyyy-mm-dd_Customer_Installation Report.xlsx)
- Add Work Completion UI section to InstallationEditor
  (types: 사무실(구미 숙소) 복귀 / 재택근무 전환 / 추가 외근 수행 / 업무 종료;
   sub-fields highlighted when 재택근무 전환 is selected)
- Extend InstallationContent type with optional work_completion field
- Normalize work_completion in normalizeInstallationContent
- Write work_completion rows 34-38 to Installation Excel export
- Add wc_type/wc_reason/wc_detail/wc_time_log placeholders to DOCX
- Regenerate installation-report-template.docx with Work Completion table
- Add radar chart PNG embedding: generateRadarChartSvg → sharp → ImageModule
- Fix combineInstallationSheets to preserve drawing/chart ZIP entries
- Switch DOCX builder to async; add await in docx export route

Co-Authored-By: Claude Sonnet 4.6 <noreply@anthropic.com>
</commit_message>
<xml_diff>
--- a/references/templates/installation-report-template.docx
+++ b/references/templates/installation-report-template.docx
@@ -1676,7 +1676,21 @@
               </w:tc>
             </w:tr>
           </w:tbl>
-          <w:p/>
+          <w:p>
+            <w:pPr>
+              <w:spacing w:after="40" w:before="60"/>
+              <w:jc w:val="center"/>
+            </w:pPr>
+            <w:r>
+              <w:rPr>
+                <w:rFonts w:ascii="Calibri" w:cs="Calibri" w:eastAsia="Calibri" w:hAnsi="Calibri"/>
+                <w:color w:val="1A1A2E"/>
+                <w:sz w:val="18"/>
+                <w:szCs w:val="18"/>
+              </w:rPr>
+              <w:t xml:space="preserve">{%radar_chart}</w:t>
+            </w:r>
+          </w:p>
         </w:tc>
       </w:tr>
     </w:tbl>
@@ -2011,6 +2025,296 @@
                 <w:szCs w:val="18"/>
               </w:rPr>
               <w:t xml:space="preserve">{data_location}</w:t>
+            </w:r>
+          </w:p>
+        </w:tc>
+      </w:tr>
+    </w:tbl>
+    <w:p>
+      <w:pPr>
+        <w:spacing w:after="0" w:before="80"/>
+      </w:pPr>
+    </w:p>
+    <w:tbl>
+      <w:tblPr>
+        <w:tblW w:type="pct" w:w="100%"/>
+        <w:tblBorders>
+          <w:top w:val="single" w:color="2E5FA3" w:sz="8"/>
+          <w:left w:val="single" w:color="2E5FA3" w:sz="8"/>
+          <w:bottom w:val="single" w:color="2E5FA3" w:sz="8"/>
+          <w:right w:val="single" w:color="2E5FA3" w:sz="8"/>
+          <w:insideH w:val="single" w:color="AAAAAA" w:sz="4"/>
+          <w:insideV w:val="single" w:color="AAAAAA" w:sz="4"/>
+        </w:tblBorders>
+      </w:tblPr>
+      <w:tblGrid>
+        <w:gridCol w:w="100"/>
+        <w:gridCol w:w="100"/>
+      </w:tblGrid>
+      <w:tr>
+        <w:tc>
+          <w:tcPr>
+            <w:gridSpan w:val="4"/>
+            <w:tcBorders>
+              <w:top w:val="none" w:color="FFFFFF" w:sz="0"/>
+              <w:left w:val="none" w:color="FFFFFF" w:sz="0"/>
+              <w:bottom w:val="none" w:color="FFFFFF" w:sz="0"/>
+              <w:right w:val="none" w:color="FFFFFF" w:sz="0"/>
+            </w:tcBorders>
+            <w:shd w:color="2E5FA3" w:val="solid"/>
+            <w:vAlign w:val="center"/>
+          </w:tcPr>
+          <w:p>
+            <w:pPr>
+              <w:spacing w:after="20" w:before="20"/>
+              <w:jc w:val="left"/>
+            </w:pPr>
+            <w:r>
+              <w:rPr>
+                <w:rFonts w:ascii="Calibri" w:cs="Calibri" w:eastAsia="Calibri" w:hAnsi="Calibri"/>
+                <w:b/>
+                <w:bCs/>
+                <w:color w:val="FFFFFF"/>
+                <w:sz w:val="18"/>
+                <w:szCs w:val="18"/>
+              </w:rPr>
+              <w:t xml:space="preserve">Work Completion — 작업 종료 후 근무 형태</w:t>
+            </w:r>
+          </w:p>
+        </w:tc>
+      </w:tr>
+      <w:tr>
+        <w:tc>
+          <w:tcPr>
+            <w:tcW w:type="pct" w:w="12%"/>
+            <w:gridSpan w:val="1"/>
+            <w:tcBorders>
+              <w:top w:val="single" w:color="AAAAAA" w:sz="4"/>
+              <w:left w:val="single" w:color="AAAAAA" w:sz="4"/>
+              <w:bottom w:val="single" w:color="AAAAAA" w:sz="4"/>
+              <w:right w:val="single" w:color="AAAAAA" w:sz="4"/>
+            </w:tcBorders>
+            <w:shd w:color="D9E2F3" w:val="solid"/>
+            <w:vAlign w:val="center"/>
+          </w:tcPr>
+          <w:p>
+            <w:pPr>
+              <w:spacing w:after="20" w:before="20"/>
+            </w:pPr>
+            <w:r>
+              <w:rPr>
+                <w:rFonts w:ascii="Calibri" w:cs="Calibri" w:eastAsia="Calibri" w:hAnsi="Calibri"/>
+                <w:b/>
+                <w:bCs/>
+                <w:color w:val="1B3769"/>
+                <w:sz w:val="17"/>
+                <w:szCs w:val="17"/>
+              </w:rPr>
+              <w:t xml:space="preserve">근무 형태</w:t>
+            </w:r>
+          </w:p>
+        </w:tc>
+        <w:tc>
+          <w:tcPr>
+            <w:tcW w:type="pct" w:w="88%"/>
+            <w:gridSpan w:val="3"/>
+            <w:tcBorders>
+              <w:top w:val="single" w:color="AAAAAA" w:sz="4"/>
+              <w:left w:val="single" w:color="AAAAAA" w:sz="4"/>
+              <w:bottom w:val="single" w:color="AAAAAA" w:sz="4"/>
+              <w:right w:val="single" w:color="AAAAAA" w:sz="4"/>
+            </w:tcBorders>
+            <w:vAlign w:val="center"/>
+          </w:tcPr>
+          <w:p>
+            <w:pPr>
+              <w:spacing w:after="20" w:before="20"/>
+            </w:pPr>
+            <w:r>
+              <w:rPr>
+                <w:rFonts w:ascii="Calibri" w:cs="Calibri" w:eastAsia="Calibri" w:hAnsi="Calibri"/>
+                <w:color w:val="1A1A2E"/>
+                <w:sz w:val="18"/>
+                <w:szCs w:val="18"/>
+              </w:rPr>
+              <w:t xml:space="preserve">{wc_type}</w:t>
+            </w:r>
+          </w:p>
+        </w:tc>
+      </w:tr>
+      <w:tr>
+        <w:tc>
+          <w:tcPr>
+            <w:tcW w:type="pct" w:w="12%"/>
+            <w:gridSpan w:val="1"/>
+            <w:tcBorders>
+              <w:top w:val="single" w:color="AAAAAA" w:sz="4"/>
+              <w:left w:val="single" w:color="AAAAAA" w:sz="4"/>
+              <w:bottom w:val="single" w:color="AAAAAA" w:sz="4"/>
+              <w:right w:val="single" w:color="AAAAAA" w:sz="4"/>
+            </w:tcBorders>
+            <w:shd w:color="D9E2F3" w:val="solid"/>
+            <w:vAlign w:val="center"/>
+          </w:tcPr>
+          <w:p>
+            <w:pPr>
+              <w:spacing w:after="20" w:before="20"/>
+            </w:pPr>
+            <w:r>
+              <w:rPr>
+                <w:rFonts w:ascii="Calibri" w:cs="Calibri" w:eastAsia="Calibri" w:hAnsi="Calibri"/>
+                <w:b/>
+                <w:bCs/>
+                <w:color w:val="1B3769"/>
+                <w:sz w:val="17"/>
+                <w:szCs w:val="17"/>
+              </w:rPr>
+              <w:t xml:space="preserve">전환 사유</w:t>
+            </w:r>
+          </w:p>
+        </w:tc>
+        <w:tc>
+          <w:tcPr>
+            <w:tcW w:type="pct" w:w="88%"/>
+            <w:gridSpan w:val="3"/>
+            <w:tcBorders>
+              <w:top w:val="single" w:color="AAAAAA" w:sz="4"/>
+              <w:left w:val="single" w:color="AAAAAA" w:sz="4"/>
+              <w:bottom w:val="single" w:color="AAAAAA" w:sz="4"/>
+              <w:right w:val="single" w:color="AAAAAA" w:sz="4"/>
+            </w:tcBorders>
+            <w:vAlign w:val="center"/>
+          </w:tcPr>
+          <w:p>
+            <w:pPr>
+              <w:spacing w:after="20" w:before="20"/>
+            </w:pPr>
+            <w:r>
+              <w:rPr>
+                <w:rFonts w:ascii="Calibri" w:cs="Calibri" w:eastAsia="Calibri" w:hAnsi="Calibri"/>
+                <w:color w:val="1A1A2E"/>
+                <w:sz w:val="18"/>
+                <w:szCs w:val="18"/>
+              </w:rPr>
+              <w:t xml:space="preserve">{wc_reason}</w:t>
+            </w:r>
+          </w:p>
+        </w:tc>
+      </w:tr>
+      <w:tr>
+        <w:tc>
+          <w:tcPr>
+            <w:tcW w:type="pct" w:w="12%"/>
+            <w:gridSpan w:val="1"/>
+            <w:tcBorders>
+              <w:top w:val="single" w:color="AAAAAA" w:sz="4"/>
+              <w:left w:val="single" w:color="AAAAAA" w:sz="4"/>
+              <w:bottom w:val="single" w:color="AAAAAA" w:sz="4"/>
+              <w:right w:val="single" w:color="AAAAAA" w:sz="4"/>
+            </w:tcBorders>
+            <w:shd w:color="D9E2F3" w:val="solid"/>
+            <w:vAlign w:val="center"/>
+          </w:tcPr>
+          <w:p>
+            <w:pPr>
+              <w:spacing w:after="20" w:before="20"/>
+            </w:pPr>
+            <w:r>
+              <w:rPr>
+                <w:rFonts w:ascii="Calibri" w:cs="Calibri" w:eastAsia="Calibri" w:hAnsi="Calibri"/>
+                <w:b/>
+                <w:bCs/>
+                <w:color w:val="1B3769"/>
+                <w:sz w:val="17"/>
+                <w:szCs w:val="17"/>
+              </w:rPr>
+              <w:t xml:space="preserve">수행 업무</w:t>
+            </w:r>
+          </w:p>
+        </w:tc>
+        <w:tc>
+          <w:tcPr>
+            <w:tcW w:type="pct" w:w="88%"/>
+            <w:gridSpan w:val="3"/>
+            <w:tcBorders>
+              <w:top w:val="single" w:color="AAAAAA" w:sz="4"/>
+              <w:left w:val="single" w:color="AAAAAA" w:sz="4"/>
+              <w:bottom w:val="single" w:color="AAAAAA" w:sz="4"/>
+              <w:right w:val="single" w:color="AAAAAA" w:sz="4"/>
+            </w:tcBorders>
+            <w:vAlign w:val="center"/>
+          </w:tcPr>
+          <w:p>
+            <w:pPr>
+              <w:spacing w:after="20" w:before="20"/>
+            </w:pPr>
+            <w:r>
+              <w:rPr>
+                <w:rFonts w:ascii="Calibri" w:cs="Calibri" w:eastAsia="Calibri" w:hAnsi="Calibri"/>
+                <w:color w:val="1A1A2E"/>
+                <w:sz w:val="18"/>
+                <w:szCs w:val="18"/>
+              </w:rPr>
+              <w:t xml:space="preserve">{wc_detail}</w:t>
+            </w:r>
+          </w:p>
+        </w:tc>
+      </w:tr>
+      <w:tr>
+        <w:tc>
+          <w:tcPr>
+            <w:tcW w:type="pct" w:w="12%"/>
+            <w:gridSpan w:val="1"/>
+            <w:tcBorders>
+              <w:top w:val="single" w:color="AAAAAA" w:sz="4"/>
+              <w:left w:val="single" w:color="AAAAAA" w:sz="4"/>
+              <w:bottom w:val="single" w:color="AAAAAA" w:sz="4"/>
+              <w:right w:val="single" w:color="AAAAAA" w:sz="4"/>
+            </w:tcBorders>
+            <w:shd w:color="D9E2F3" w:val="solid"/>
+            <w:vAlign w:val="center"/>
+          </w:tcPr>
+          <w:p>
+            <w:pPr>
+              <w:spacing w:after="20" w:before="20"/>
+            </w:pPr>
+            <w:r>
+              <w:rPr>
+                <w:rFonts w:ascii="Calibri" w:cs="Calibri" w:eastAsia="Calibri" w:hAnsi="Calibri"/>
+                <w:b/>
+                <w:bCs/>
+                <w:color w:val="1B3769"/>
+                <w:sz w:val="17"/>
+                <w:szCs w:val="17"/>
+              </w:rPr>
+              <w:t xml:space="preserve">수행 시간</w:t>
+            </w:r>
+          </w:p>
+        </w:tc>
+        <w:tc>
+          <w:tcPr>
+            <w:tcW w:type="pct" w:w="88%"/>
+            <w:gridSpan w:val="3"/>
+            <w:tcBorders>
+              <w:top w:val="single" w:color="AAAAAA" w:sz="4"/>
+              <w:left w:val="single" w:color="AAAAAA" w:sz="4"/>
+              <w:bottom w:val="single" w:color="AAAAAA" w:sz="4"/>
+              <w:right w:val="single" w:color="AAAAAA" w:sz="4"/>
+            </w:tcBorders>
+            <w:vAlign w:val="center"/>
+          </w:tcPr>
+          <w:p>
+            <w:pPr>
+              <w:spacing w:after="20" w:before="20"/>
+            </w:pPr>
+            <w:r>
+              <w:rPr>
+                <w:rFonts w:ascii="Calibri" w:cs="Calibri" w:eastAsia="Calibri" w:hAnsi="Calibri"/>
+                <w:color w:val="1A1A2E"/>
+                <w:sz w:val="18"/>
+                <w:szCs w:val="18"/>
+              </w:rPr>
+              <w:t xml:space="preserve">{wc_time_log}</w:t>
             </w:r>
           </w:p>
         </w:tc>

</xml_diff>